<commit_message>
way of working documentation updated
Co-Authored-By: Claude Opus 4.6 <noreply@anthropic.com>
</commit_message>
<xml_diff>
--- a/docs/ecosystem/how-we-work/FringeIsland-how-we-work_2.docx
+++ b/docs/ecosystem/how-we-work/FringeIsland-how-we-work_2.docx
@@ -391,8 +391,124 @@
         <w:pStyle w:val="Heading2"/>
       </w:pPr>
       <w:r>
+        <w:t>What this shows</w:t>
+      </w:r>
+    </w:p>
+    <w:p>
+      <w:pPr>
+        <w:spacing w:after="140" w:line="320" w:lineRule="auto"/>
+      </w:pPr>
+      <w:r>
         <w:lastRenderedPageBreak/>
-        <w:t>What this shows</w:t>
+        <w:t xml:space="preserve">Work in </w:t>
+      </w:r>
+      <w:proofErr w:type="spellStart"/>
+      <w:r>
+        <w:t>FringeIsland</w:t>
+      </w:r>
+      <w:proofErr w:type="spellEnd"/>
+      <w:r>
+        <w:t xml:space="preserve"> lives in a five-level hierarchy. The same idea moves down the levels as it matures — vision-level questions become entities, entities become capabilities, capabilities become features, features become tasks. Each level answers a different question at a different frequency.</w:t>
+      </w:r>
+    </w:p>
+    <w:p>
+      <w:pPr>
+        <w:pStyle w:val="ListParagraph"/>
+        <w:numPr>
+          <w:ilvl w:val="0"/>
+          <w:numId w:val="2"/>
+        </w:numPr>
+        <w:spacing w:after="80" w:line="300" w:lineRule="auto"/>
+      </w:pPr>
+      <w:r>
+        <w:rPr>
+          <w:b/>
+          <w:bCs/>
+        </w:rPr>
+        <w:t xml:space="preserve">L1 — Vision. </w:t>
+      </w:r>
+      <w:r>
+        <w:t>Why does this ecosystem exist? docs/ecosystem/VISION.md.</w:t>
+      </w:r>
+    </w:p>
+    <w:p>
+      <w:pPr>
+        <w:pStyle w:val="ListParagraph"/>
+        <w:numPr>
+          <w:ilvl w:val="0"/>
+          <w:numId w:val="2"/>
+        </w:numPr>
+        <w:spacing w:after="80" w:line="300" w:lineRule="auto"/>
+      </w:pPr>
+      <w:r>
+        <w:rPr>
+          <w:b/>
+          <w:bCs/>
+        </w:rPr>
+        <w:t xml:space="preserve">L2 — Entities. </w:t>
+      </w:r>
+      <w:r>
+        <w:t>What are we building and for whom? Products, platform, studios, design system, verticals.</w:t>
+      </w:r>
+    </w:p>
+    <w:p>
+      <w:pPr>
+        <w:pStyle w:val="ListParagraph"/>
+        <w:numPr>
+          <w:ilvl w:val="0"/>
+          <w:numId w:val="2"/>
+        </w:numPr>
+        <w:spacing w:after="80" w:line="300" w:lineRule="auto"/>
+      </w:pPr>
+      <w:r>
+        <w:rPr>
+          <w:b/>
+          <w:bCs/>
+        </w:rPr>
+        <w:t xml:space="preserve">L3 — Capabilities. </w:t>
+      </w:r>
+      <w:r>
+        <w:t>What capabilities are needed, who owns them, what depends on what? The most-skipped level.</w:t>
+      </w:r>
+    </w:p>
+    <w:p>
+      <w:pPr>
+        <w:pStyle w:val="ListParagraph"/>
+        <w:numPr>
+          <w:ilvl w:val="0"/>
+          <w:numId w:val="2"/>
+        </w:numPr>
+        <w:spacing w:after="80" w:line="300" w:lineRule="auto"/>
+      </w:pPr>
+      <w:r>
+        <w:rPr>
+          <w:b/>
+          <w:bCs/>
+        </w:rPr>
+        <w:t xml:space="preserve">L4 — Features. </w:t>
+      </w:r>
+      <w:r>
+        <w:t>How is each capability specified? Stories with Given/When/Then live inside feature specs.</w:t>
+      </w:r>
+    </w:p>
+    <w:p>
+      <w:pPr>
+        <w:pStyle w:val="ListParagraph"/>
+        <w:numPr>
+          <w:ilvl w:val="0"/>
+          <w:numId w:val="2"/>
+        </w:numPr>
+        <w:spacing w:after="80" w:line="300" w:lineRule="auto"/>
+      </w:pPr>
+      <w:r>
+        <w:rPr>
+          <w:b/>
+          <w:bCs/>
+        </w:rPr>
+        <w:t xml:space="preserve">L5 — Tasks. </w:t>
+      </w:r>
+      <w:r>
+        <w:t>What implementation work is needed? Ephemeral — deleted after the cycle retrospective.</w:t>
       </w:r>
     </w:p>
     <w:p>
@@ -400,115 +516,15 @@
         <w:spacing w:after="140" w:line="320" w:lineRule="auto"/>
       </w:pPr>
       <w:r>
-        <w:t xml:space="preserve">Work in </w:t>
-      </w:r>
-      <w:proofErr w:type="spellStart"/>
-      <w:r>
-        <w:t>FringeIsland</w:t>
-      </w:r>
-      <w:proofErr w:type="spellEnd"/>
-      <w:r>
-        <w:t xml:space="preserve"> lives in a five-level hierarchy. The same idea moves down the levels as it matures — vision-level questions become entities, entities become capabilities, capabilities become features, features become tasks. Each level answers a different question at a different frequency.</w:t>
-      </w:r>
-    </w:p>
-    <w:p>
-      <w:pPr>
-        <w:pStyle w:val="ListParagraph"/>
-        <w:numPr>
-          <w:ilvl w:val="0"/>
-          <w:numId w:val="2"/>
-        </w:numPr>
-        <w:spacing w:after="80" w:line="300" w:lineRule="auto"/>
-      </w:pPr>
-      <w:r>
-        <w:rPr>
-          <w:b/>
-          <w:bCs/>
-        </w:rPr>
-        <w:t xml:space="preserve">L1 — Vision. </w:t>
-      </w:r>
-      <w:r>
-        <w:t>Why does this ecosystem exist? docs/ecosystem/VISION.md.</w:t>
-      </w:r>
-    </w:p>
-    <w:p>
-      <w:pPr>
-        <w:pStyle w:val="ListParagraph"/>
-        <w:numPr>
-          <w:ilvl w:val="0"/>
-          <w:numId w:val="2"/>
-        </w:numPr>
-        <w:spacing w:after="80" w:line="300" w:lineRule="auto"/>
-      </w:pPr>
-      <w:r>
-        <w:rPr>
-          <w:b/>
-          <w:bCs/>
-        </w:rPr>
-        <w:t xml:space="preserve">L2 — Entities. </w:t>
-      </w:r>
-      <w:r>
-        <w:t>What are we building and for whom? Products, platform, studios, design system, verticals.</w:t>
-      </w:r>
-    </w:p>
-    <w:p>
-      <w:pPr>
-        <w:pStyle w:val="ListParagraph"/>
-        <w:numPr>
-          <w:ilvl w:val="0"/>
-          <w:numId w:val="2"/>
-        </w:numPr>
-        <w:spacing w:after="80" w:line="300" w:lineRule="auto"/>
-      </w:pPr>
-      <w:r>
-        <w:rPr>
-          <w:b/>
-          <w:bCs/>
-        </w:rPr>
-        <w:t xml:space="preserve">L3 — Capabilities. </w:t>
-      </w:r>
-      <w:r>
-        <w:t>What capabilities are needed, who owns them, what depends on what? The most-skipped level.</w:t>
-      </w:r>
-    </w:p>
-    <w:p>
-      <w:pPr>
-        <w:pStyle w:val="ListParagraph"/>
-        <w:numPr>
-          <w:ilvl w:val="0"/>
-          <w:numId w:val="2"/>
-        </w:numPr>
-        <w:spacing w:after="80" w:line="300" w:lineRule="auto"/>
-      </w:pPr>
-      <w:r>
-        <w:rPr>
-          <w:b/>
-          <w:bCs/>
-        </w:rPr>
-        <w:t xml:space="preserve">L4 — Features. </w:t>
-      </w:r>
-      <w:r>
-        <w:t>How is each capability specified? Stories with Given/When/Then live inside feature specs.</w:t>
-      </w:r>
-    </w:p>
-    <w:p>
-      <w:pPr>
-        <w:pStyle w:val="ListParagraph"/>
-        <w:numPr>
-          <w:ilvl w:val="0"/>
-          <w:numId w:val="2"/>
-        </w:numPr>
-        <w:spacing w:after="80" w:line="300" w:lineRule="auto"/>
-      </w:pPr>
-      <w:r>
-        <w:rPr>
-          <w:b/>
-          <w:bCs/>
-        </w:rPr>
-        <w:t xml:space="preserve">L5 — Tasks. </w:t>
-      </w:r>
-      <w:r>
-        <w:t>What implementation work is needed? Ephemeral — deleted after the cycle retrospective.</w:t>
+        <w:t>A single feature spec file carries the feature from maturity 0-raw all the way to 6-done. The state is tracked in YAML frontmatter, not by which folder the file lives in.</w:t>
+      </w:r>
+    </w:p>
+    <w:p>
+      <w:pPr>
+        <w:pStyle w:val="Heading2"/>
+      </w:pPr>
+      <w:r>
+        <w:t>The five verticals thread through every level</w:t>
       </w:r>
     </w:p>
     <w:p>
@@ -516,7 +532,23 @@
         <w:spacing w:after="140" w:line="320" w:lineRule="auto"/>
       </w:pPr>
       <w:r>
-        <w:t>A single feature spec file carries the feature from maturity 0-raw all the way to 6-done. The state is tracked in YAML frontmatter, not by which folder the file lives in.</w:t>
+        <w:t>Running vertically through the diagram are five amber dashed columns — Administration, Privacy/GDPR, Notifications, Observability, Transactions. These are not a sixth level; they are obligations that cut through every level.</w:t>
+      </w:r>
+    </w:p>
+    <w:p>
+      <w:pPr>
+        <w:spacing w:after="140" w:line="320" w:lineRule="auto"/>
+      </w:pPr>
+      <w:r>
+        <w:t>The verticals exist because vision-level principles demand them. "Privacy over commercial opportunity" is a founding principle — Privacy as a vertical is how that principle becomes operational at every tier below. The same pattern applies to the other four. They are locked at five by ADR-U002.</w:t>
+      </w:r>
+    </w:p>
+    <w:p>
+      <w:pPr>
+        <w:spacing w:after="140" w:line="320" w:lineRule="auto"/>
+      </w:pPr>
+      <w:r>
+        <w:t>Every feature spec template mandates a Vertical Impact section addressing all five verticals. No blanks. If a feature does not touch a given vertical, the spec says "None" with rationale — the vertical still gets addressed, just negatively.</w:t>
       </w:r>
     </w:p>
     <w:p>
@@ -524,7 +556,7 @@
         <w:pStyle w:val="Heading2"/>
       </w:pPr>
       <w:r>
-        <w:t>The five verticals thread through every level</w:t>
+        <w:t>Why this axis matters</w:t>
       </w:r>
     </w:p>
     <w:p>
@@ -532,7 +564,7 @@
         <w:spacing w:after="140" w:line="320" w:lineRule="auto"/>
       </w:pPr>
       <w:r>
-        <w:t>Running vertically through the diagram are five amber dashed columns — Administration, Privacy/GDPR, Notifications, Observability, Transactions. These are not a sixth level; they are obligations that cut through every level.</w:t>
+        <w:t>The decomposition cascade is the architecture of the development process, not just of the code. Documentation hierarchy, folder structure, README cascades, and YAML frontmatter function as the API for the entire development process. Getting this axis right is the difference between a solo developer’s convenience tree and an ecosystem that fifty contributors can navigate without getting lost.</w:t>
       </w:r>
     </w:p>
     <w:p>
@@ -540,15 +572,7 @@
         <w:spacing w:after="140" w:line="320" w:lineRule="auto"/>
       </w:pPr>
       <w:r>
-        <w:t>The verticals exist because vision-level principles demand them. "Privacy over commercial opportunity" is a founding principle — Privacy as a vertical is how that principle becomes operational at every tier below. The same pattern applies to the other four. They are locked at five by ADR-U002.</w:t>
-      </w:r>
-    </w:p>
-    <w:p>
-      <w:pPr>
-        <w:spacing w:after="140" w:line="320" w:lineRule="auto"/>
-      </w:pPr>
-      <w:r>
-        <w:t>Every feature spec template mandates a Vertical Impact section addressing all five verticals. No blanks. If a feature does not touch a given vertical, the spec says "None" with rationale — the vertical still gets addressed, just negatively.</w:t>
+        <w:t>Every ambiguity at this level propagates downward. A fuzzy L2 ownership produces ambiguous L4 spec homes. A skipped L3 capability map produces L4 specs without dependencies named. An unpopulated vertical spec at the cross-cut produces L4 specs with quiet assumptions.</w:t>
       </w:r>
     </w:p>
     <w:p>
@@ -556,31 +580,7 @@
         <w:pStyle w:val="Heading2"/>
       </w:pPr>
       <w:r>
-        <w:t>Why this axis matters</w:t>
-      </w:r>
-    </w:p>
-    <w:p>
-      <w:pPr>
-        <w:spacing w:after="140" w:line="320" w:lineRule="auto"/>
-      </w:pPr>
-      <w:r>
-        <w:t>The decomposition cascade is the architecture of the development process, not just of the code. Documentation hierarchy, folder structure, README cascades, and YAML frontmatter function as the API for the entire development process. Getting this axis right is the difference between a solo developer’s convenience tree and an ecosystem that fifty contributors can navigate without getting lost.</w:t>
-      </w:r>
-    </w:p>
-    <w:p>
-      <w:pPr>
-        <w:spacing w:after="140" w:line="320" w:lineRule="auto"/>
-      </w:pPr>
-      <w:r>
         <w:lastRenderedPageBreak/>
-        <w:t>Every ambiguity at this level propagates downward. A fuzzy L2 ownership produces ambiguous L4 spec homes. A skipped L3 capability map produces L4 specs without dependencies named. An unpopulated vertical spec at the cross-cut produces L4 specs with quiet assumptions.</w:t>
-      </w:r>
-    </w:p>
-    <w:p>
-      <w:pPr>
-        <w:pStyle w:val="Heading2"/>
-      </w:pPr>
-      <w:r>
         <w:t>Gaps on this axis</w:t>
       </w:r>
     </w:p>
@@ -694,7 +694,6 @@
         <w:rPr>
           <w:noProof/>
         </w:rPr>
-        <w:lastRenderedPageBreak/>
         <w:drawing>
           <wp:inline distT="0" distB="0" distL="0" distR="0" wp14:anchorId="332C6D30" wp14:editId="4A658EB2">
             <wp:extent cx="5943600" cy="7515225"/>
@@ -740,6 +739,7 @@
         <w:pStyle w:val="Heading2"/>
       </w:pPr>
       <w:r>
+        <w:lastRenderedPageBreak/>
         <w:t>What this shows</w:t>
       </w:r>
     </w:p>
@@ -765,7 +765,6 @@
           <w:b/>
           <w:bCs/>
         </w:rPr>
-        <w:lastRenderedPageBreak/>
         <w:t xml:space="preserve">Waves band (top). </w:t>
       </w:r>
       <w:r>
@@ -1147,7 +1146,6 @@
         <w:rPr>
           <w:noProof/>
         </w:rPr>
-        <w:lastRenderedPageBreak/>
         <w:drawing>
           <wp:inline distT="0" distB="0" distL="0" distR="0" wp14:anchorId="35202EB6" wp14:editId="2EACD31C">
             <wp:extent cx="5943600" cy="7343775"/>
@@ -1193,6 +1191,7 @@
         <w:pStyle w:val="Heading2"/>
       </w:pPr>
       <w:r>
+        <w:lastRenderedPageBreak/>
         <w:t>What this shows</w:t>
       </w:r>
     </w:p>
@@ -1218,7 +1217,6 @@
           <w:b/>
           <w:bCs/>
         </w:rPr>
-        <w:lastRenderedPageBreak/>
         <w:t xml:space="preserve">Progressive elaboration (top), maturity 0 to 4. </w:t>
       </w:r>
       <w:r>
@@ -1687,15 +1685,15 @@
         <w:pStyle w:val="Heading2"/>
       </w:pPr>
       <w:r>
+        <w:t>Definition of Done is the gate out</w:t>
+      </w:r>
+    </w:p>
+    <w:p>
+      <w:pPr>
+        <w:spacing w:after="140" w:line="320" w:lineRule="auto"/>
+      </w:pPr>
+      <w:r>
         <w:lastRenderedPageBreak/>
-        <w:t>Definition of Done is the gate out</w:t>
-      </w:r>
-    </w:p>
-    <w:p>
-      <w:pPr>
-        <w:spacing w:after="140" w:line="320" w:lineRule="auto"/>
-      </w:pPr>
-      <w:r>
         <w:t xml:space="preserve">DoD is universal across all work. Every applicable box must check: acceptance criteria implemented and verified; </w:t>
       </w:r>
       <w:proofErr w:type="spellStart"/>
@@ -1946,8 +1944,92 @@
         <w:pStyle w:val="Heading2"/>
       </w:pPr>
       <w:r>
+        <w:t>What this shows</w:t>
+      </w:r>
+    </w:p>
+    <w:p>
+      <w:pPr>
+        <w:spacing w:after="140" w:line="320" w:lineRule="auto"/>
+      </w:pPr>
+      <w:r>
+        <w:t>Three stacked sections.</w:t>
+      </w:r>
+    </w:p>
+    <w:p>
+      <w:pPr>
+        <w:pStyle w:val="ListParagraph"/>
+        <w:numPr>
+          <w:ilvl w:val="0"/>
+          <w:numId w:val="2"/>
+        </w:numPr>
+        <w:spacing w:after="80" w:line="300" w:lineRule="auto"/>
+      </w:pPr>
+      <w:r>
+        <w:rPr>
+          <w:b/>
+          <w:bCs/>
+        </w:rPr>
         <w:lastRenderedPageBreak/>
-        <w:t>What this shows</w:t>
+        <w:t xml:space="preserve">The build loop (top). </w:t>
+      </w:r>
+      <w:r>
+        <w:t>Research → Plan → Annotate → Implement. The canonical pattern for working with an AI coding agent. Markdown files serve as shared mutable state between the developer and the agent.</w:t>
+      </w:r>
+    </w:p>
+    <w:p>
+      <w:pPr>
+        <w:pStyle w:val="ListParagraph"/>
+        <w:numPr>
+          <w:ilvl w:val="0"/>
+          <w:numId w:val="2"/>
+        </w:numPr>
+        <w:spacing w:after="80" w:line="300" w:lineRule="auto"/>
+      </w:pPr>
+      <w:r>
+        <w:rPr>
+          <w:b/>
+          <w:bCs/>
+        </w:rPr>
+        <w:t xml:space="preserve">Given/When/Then feeds three test layers (middle). </w:t>
+      </w:r>
+      <w:r>
+        <w:t>The same BDD scenario from the feature spec becomes the input to unit tests (TDD-style), integration tests (BDD-style), and E2E tests (critical paths). One source, three layers.</w:t>
+      </w:r>
+    </w:p>
+    <w:p>
+      <w:pPr>
+        <w:pStyle w:val="ListParagraph"/>
+        <w:numPr>
+          <w:ilvl w:val="0"/>
+          <w:numId w:val="2"/>
+        </w:numPr>
+        <w:spacing w:after="80" w:line="300" w:lineRule="auto"/>
+      </w:pPr>
+      <w:r>
+        <w:rPr>
+          <w:b/>
+          <w:bCs/>
+        </w:rPr>
+        <w:t xml:space="preserve">The Testing Trophy (bottom). </w:t>
+      </w:r>
+      <w:r>
+        <w:t xml:space="preserve">Relative effort per layer. Integration is the biggest band. Static analysis is the free foundation. E2E and database tests are smaller but critical — database tests especially matter in a </w:t>
+      </w:r>
+      <w:proofErr w:type="spellStart"/>
+      <w:r>
+        <w:t>Supabase</w:t>
+      </w:r>
+      <w:proofErr w:type="spellEnd"/>
+      <w:r>
+        <w:t>-RLS-heavy stack.</w:t>
+      </w:r>
+    </w:p>
+    <w:p>
+      <w:pPr>
+        <w:pStyle w:val="Heading2"/>
+      </w:pPr>
+      <w:r>
+        <w:t>The build loop: Research → Plan → Annotate → Implement</w:t>
       </w:r>
     </w:p>
     <w:p>
@@ -1955,75 +2037,195 @@
         <w:spacing w:after="140" w:line="320" w:lineRule="auto"/>
       </w:pPr>
       <w:r>
-        <w:t>Three stacked sections.</w:t>
-      </w:r>
-    </w:p>
-    <w:p>
-      <w:pPr>
-        <w:pStyle w:val="ListParagraph"/>
-        <w:numPr>
-          <w:ilvl w:val="0"/>
-          <w:numId w:val="2"/>
-        </w:numPr>
-        <w:spacing w:after="80" w:line="300" w:lineRule="auto"/>
-      </w:pPr>
-      <w:r>
-        <w:rPr>
-          <w:b/>
-          <w:bCs/>
-        </w:rPr>
-        <w:t xml:space="preserve">The build loop (top). </w:t>
-      </w:r>
-      <w:r>
-        <w:t>Research → Plan → Annotate → Implement. The canonical pattern for working with an AI coding agent. Markdown files serve as shared mutable state between the developer and the agent.</w:t>
-      </w:r>
-    </w:p>
-    <w:p>
-      <w:pPr>
-        <w:pStyle w:val="ListParagraph"/>
-        <w:numPr>
-          <w:ilvl w:val="0"/>
-          <w:numId w:val="2"/>
-        </w:numPr>
-        <w:spacing w:after="80" w:line="300" w:lineRule="auto"/>
-      </w:pPr>
-      <w:r>
-        <w:rPr>
-          <w:b/>
-          <w:bCs/>
-        </w:rPr>
-        <w:t xml:space="preserve">Given/When/Then feeds three test layers (middle). </w:t>
-      </w:r>
-      <w:r>
-        <w:t>The same BDD scenario from the feature spec becomes the input to unit tests (TDD-style), integration tests (BDD-style), and E2E tests (critical paths). One source, three layers.</w:t>
-      </w:r>
-    </w:p>
-    <w:p>
-      <w:pPr>
-        <w:pStyle w:val="ListParagraph"/>
-        <w:numPr>
-          <w:ilvl w:val="0"/>
-          <w:numId w:val="2"/>
-        </w:numPr>
-        <w:spacing w:after="80" w:line="300" w:lineRule="auto"/>
-      </w:pPr>
-      <w:r>
-        <w:rPr>
-          <w:b/>
-          <w:bCs/>
-        </w:rPr>
-        <w:t xml:space="preserve">The Testing Trophy (bottom). </w:t>
-      </w:r>
-      <w:r>
-        <w:t xml:space="preserve">Relative effort per layer. Integration is the biggest band. Static analysis is the free foundation. E2E and database tests are smaller but critical — database tests especially matter in a </w:t>
+        <w:t>This is the core working pattern with an AI coding agent. The markdown file is the interface. It is read and written by both the developer and the agent. It carries the state of the work across turns.</w:t>
+      </w:r>
+    </w:p>
+    <w:p>
+      <w:pPr>
+        <w:pStyle w:val="ListParagraph"/>
+        <w:numPr>
+          <w:ilvl w:val="0"/>
+          <w:numId w:val="2"/>
+        </w:numPr>
+        <w:spacing w:after="80" w:line="300" w:lineRule="auto"/>
+      </w:pPr>
+      <w:r>
+        <w:rPr>
+          <w:b/>
+          <w:bCs/>
+        </w:rPr>
+        <w:t xml:space="preserve">1. Research. </w:t>
+      </w:r>
+      <w:r>
+        <w:t>The agent reads relevant code and writes findings to a research document.</w:t>
+      </w:r>
+    </w:p>
+    <w:p>
+      <w:pPr>
+        <w:pStyle w:val="ListParagraph"/>
+        <w:numPr>
+          <w:ilvl w:val="0"/>
+          <w:numId w:val="2"/>
+        </w:numPr>
+        <w:spacing w:after="80" w:line="300" w:lineRule="auto"/>
+      </w:pPr>
+      <w:r>
+        <w:rPr>
+          <w:b/>
+          <w:bCs/>
+        </w:rPr>
+        <w:t xml:space="preserve">2. Plan. </w:t>
+      </w:r>
+      <w:r>
+        <w:t>The agent produces a detailed implementation plan with code snippets in a plan document.</w:t>
+      </w:r>
+    </w:p>
+    <w:p>
+      <w:pPr>
+        <w:pStyle w:val="ListParagraph"/>
+        <w:numPr>
+          <w:ilvl w:val="0"/>
+          <w:numId w:val="2"/>
+        </w:numPr>
+        <w:spacing w:after="80" w:line="300" w:lineRule="auto"/>
+      </w:pPr>
+      <w:r>
+        <w:rPr>
+          <w:b/>
+          <w:bCs/>
+        </w:rPr>
+        <w:t xml:space="preserve">3. Annotate. </w:t>
+      </w:r>
+      <w:r>
+        <w:t>The developer reviews the plan, adds inline notes, then instructs the agent: "I added notes, address them and update the plan. Don’t implement yet." The guard phrase is critical.</w:t>
+      </w:r>
+    </w:p>
+    <w:p>
+      <w:pPr>
+        <w:pStyle w:val="ListParagraph"/>
+        <w:numPr>
+          <w:ilvl w:val="0"/>
+          <w:numId w:val="2"/>
+        </w:numPr>
+        <w:spacing w:after="80" w:line="300" w:lineRule="auto"/>
+      </w:pPr>
+      <w:r>
+        <w:rPr>
+          <w:b/>
+          <w:bCs/>
+        </w:rPr>
+        <w:t xml:space="preserve">4. Implement. </w:t>
+      </w:r>
+      <w:r>
+        <w:t>Once the plan is solid, the developer instructs: "Implement it all. Mark tasks as completed in the plan document."</w:t>
+      </w:r>
+    </w:p>
+    <w:p>
+      <w:pPr>
+        <w:spacing w:after="140" w:line="320" w:lineRule="auto"/>
+      </w:pPr>
+      <w:r>
+        <w:t>This is the concrete mechanism that makes "documentation IS the primary artifact, code is the byproduct" operational at the task level — not an aspirational slogan.</w:t>
+      </w:r>
+    </w:p>
+    <w:p>
+      <w:pPr>
+        <w:pStyle w:val="Heading2"/>
+      </w:pPr>
+      <w:r>
+        <w:t>Given/When/Then is one source, three test sites</w:t>
+      </w:r>
+    </w:p>
+    <w:p>
+      <w:pPr>
+        <w:spacing w:after="140" w:line="320" w:lineRule="auto"/>
+      </w:pPr>
+      <w:r>
+        <w:t>The feature spec template requires each story to have Given/When/Then acceptance criteria inline. Those same scenarios are then the canonical source for test writing at three layers.</w:t>
+      </w:r>
+    </w:p>
+    <w:p>
+      <w:pPr>
+        <w:pStyle w:val="ListParagraph"/>
+        <w:numPr>
+          <w:ilvl w:val="0"/>
+          <w:numId w:val="2"/>
+        </w:numPr>
+        <w:spacing w:after="80" w:line="300" w:lineRule="auto"/>
+      </w:pPr>
+      <w:r>
+        <w:rPr>
+          <w:b/>
+          <w:bCs/>
+        </w:rPr>
+        <w:t xml:space="preserve">Unit tests (TDD-style, Jest). </w:t>
+      </w:r>
+      <w:r>
+        <w:t>Test the hardest-to-debug internal logic.</w:t>
+      </w:r>
+    </w:p>
+    <w:p>
+      <w:pPr>
+        <w:pStyle w:val="ListParagraph"/>
+        <w:numPr>
+          <w:ilvl w:val="0"/>
+          <w:numId w:val="2"/>
+        </w:numPr>
+        <w:spacing w:after="80" w:line="300" w:lineRule="auto"/>
+      </w:pPr>
+      <w:r>
+        <w:rPr>
+          <w:b/>
+          <w:bCs/>
+        </w:rPr>
+        <w:t xml:space="preserve">Integration tests (BDD-style, Jest + </w:t>
       </w:r>
       <w:proofErr w:type="spellStart"/>
       <w:r>
+        <w:rPr>
+          <w:b/>
+          <w:bCs/>
+        </w:rPr>
         <w:t>Supabase</w:t>
       </w:r>
       <w:proofErr w:type="spellEnd"/>
       <w:r>
-        <w:t>-RLS-heavy stack.</w:t>
+        <w:rPr>
+          <w:b/>
+          <w:bCs/>
+        </w:rPr>
+        <w:t xml:space="preserve">). </w:t>
+      </w:r>
+      <w:r>
+        <w:t>API routes with their real database, components with their real dependencies. The largest layer per the Testing Trophy.</w:t>
+      </w:r>
+    </w:p>
+    <w:p>
+      <w:pPr>
+        <w:pStyle w:val="ListParagraph"/>
+        <w:numPr>
+          <w:ilvl w:val="0"/>
+          <w:numId w:val="2"/>
+        </w:numPr>
+        <w:spacing w:after="80" w:line="300" w:lineRule="auto"/>
+      </w:pPr>
+      <w:r>
+        <w:rPr>
+          <w:b/>
+          <w:bCs/>
+        </w:rPr>
+        <w:t xml:space="preserve">E2E tests (Playwright). </w:t>
+      </w:r>
+      <w:r>
+        <w:t>Critical user paths only — signup → onboarding → core feature flow.</w:t>
+      </w:r>
+    </w:p>
+    <w:p>
+      <w:pPr>
+        <w:spacing w:after="140" w:line="320" w:lineRule="auto"/>
+      </w:pPr>
+      <w:r>
+        <w:t>The value of keeping the source canonical in the feature spec is that the same scenario can be referenced from any of the three test files — and when the scenario changes, all three test layers know where to look.</w:t>
       </w:r>
     </w:p>
     <w:p>
@@ -2031,7 +2233,7 @@
         <w:pStyle w:val="Heading2"/>
       </w:pPr>
       <w:r>
-        <w:t>The build loop: Research → Plan → Annotate → Implement</w:t>
+        <w:t>The Testing Trophy shape</w:t>
       </w:r>
     </w:p>
     <w:p>
@@ -2039,211 +2241,7 @@
         <w:spacing w:after="140" w:line="320" w:lineRule="auto"/>
       </w:pPr>
       <w:r>
-        <w:t>This is the core working pattern with an AI coding agent. The markdown file is the interface. It is read and written by both the developer and the agent. It carries the state of the work across turns.</w:t>
-      </w:r>
-    </w:p>
-    <w:p>
-      <w:pPr>
-        <w:pStyle w:val="ListParagraph"/>
-        <w:numPr>
-          <w:ilvl w:val="0"/>
-          <w:numId w:val="2"/>
-        </w:numPr>
-        <w:spacing w:after="80" w:line="300" w:lineRule="auto"/>
-      </w:pPr>
-      <w:r>
-        <w:rPr>
-          <w:b/>
-          <w:bCs/>
-        </w:rPr>
-        <w:t xml:space="preserve">1. Research. </w:t>
-      </w:r>
-      <w:r>
-        <w:t>The agent reads relevant code and writes findings to a research document.</w:t>
-      </w:r>
-    </w:p>
-    <w:p>
-      <w:pPr>
-        <w:pStyle w:val="ListParagraph"/>
-        <w:numPr>
-          <w:ilvl w:val="0"/>
-          <w:numId w:val="2"/>
-        </w:numPr>
-        <w:spacing w:after="80" w:line="300" w:lineRule="auto"/>
-      </w:pPr>
-      <w:r>
-        <w:rPr>
-          <w:b/>
-          <w:bCs/>
-        </w:rPr>
-        <w:t xml:space="preserve">2. Plan. </w:t>
-      </w:r>
-      <w:r>
-        <w:t>The agent produces a detailed implementation plan with code snippets in a plan document.</w:t>
-      </w:r>
-    </w:p>
-    <w:p>
-      <w:pPr>
-        <w:pStyle w:val="ListParagraph"/>
-        <w:numPr>
-          <w:ilvl w:val="0"/>
-          <w:numId w:val="2"/>
-        </w:numPr>
-        <w:spacing w:after="80" w:line="300" w:lineRule="auto"/>
-      </w:pPr>
-      <w:r>
-        <w:rPr>
-          <w:b/>
-          <w:bCs/>
-        </w:rPr>
-        <w:t xml:space="preserve">3. Annotate. </w:t>
-      </w:r>
-      <w:r>
-        <w:t>The developer reviews the plan, adds inline notes, then instructs the agent: "I added notes, address them and update the plan. Don’t implement yet." The guard phrase is critical.</w:t>
-      </w:r>
-    </w:p>
-    <w:p>
-      <w:pPr>
-        <w:pStyle w:val="ListParagraph"/>
-        <w:numPr>
-          <w:ilvl w:val="0"/>
-          <w:numId w:val="2"/>
-        </w:numPr>
-        <w:spacing w:after="80" w:line="300" w:lineRule="auto"/>
-      </w:pPr>
-      <w:r>
-        <w:rPr>
-          <w:b/>
-          <w:bCs/>
-        </w:rPr>
-        <w:t xml:space="preserve">4. Implement. </w:t>
-      </w:r>
-      <w:r>
-        <w:t>Once the plan is solid, the developer instructs: "Implement it all. Mark tasks as completed in the plan document."</w:t>
-      </w:r>
-    </w:p>
-    <w:p>
-      <w:pPr>
-        <w:spacing w:after="140" w:line="320" w:lineRule="auto"/>
-      </w:pPr>
-      <w:r>
-        <w:t>This is the concrete mechanism that makes "documentation IS the primary artifact, code is the byproduct" operational at the task level — not an aspirational slogan.</w:t>
-      </w:r>
-    </w:p>
-    <w:p>
-      <w:pPr>
-        <w:pStyle w:val="Heading2"/>
-      </w:pPr>
-      <w:r>
-        <w:t>Given/When/Then is one source, three test sites</w:t>
-      </w:r>
-    </w:p>
-    <w:p>
-      <w:pPr>
-        <w:spacing w:after="140" w:line="320" w:lineRule="auto"/>
-      </w:pPr>
-      <w:r>
-        <w:t>The feature spec template requires each story to have Given/When/Then acceptance criteria inline. Those same scenarios are then the canonical source for test writing at three layers.</w:t>
-      </w:r>
-    </w:p>
-    <w:p>
-      <w:pPr>
-        <w:pStyle w:val="ListParagraph"/>
-        <w:numPr>
-          <w:ilvl w:val="0"/>
-          <w:numId w:val="2"/>
-        </w:numPr>
-        <w:spacing w:after="80" w:line="300" w:lineRule="auto"/>
-      </w:pPr>
-      <w:r>
-        <w:rPr>
-          <w:b/>
-          <w:bCs/>
-        </w:rPr>
-        <w:t xml:space="preserve">Unit tests (TDD-style, Jest). </w:t>
-      </w:r>
-      <w:r>
-        <w:t>Test the hardest-to-debug internal logic.</w:t>
-      </w:r>
-    </w:p>
-    <w:p>
-      <w:pPr>
-        <w:pStyle w:val="ListParagraph"/>
-        <w:numPr>
-          <w:ilvl w:val="0"/>
-          <w:numId w:val="2"/>
-        </w:numPr>
-        <w:spacing w:after="80" w:line="300" w:lineRule="auto"/>
-      </w:pPr>
-      <w:r>
-        <w:rPr>
-          <w:b/>
-          <w:bCs/>
-        </w:rPr>
-        <w:t xml:space="preserve">Integration tests (BDD-style, Jest + </w:t>
-      </w:r>
-      <w:proofErr w:type="spellStart"/>
-      <w:r>
-        <w:rPr>
-          <w:b/>
-          <w:bCs/>
-        </w:rPr>
-        <w:t>Supabase</w:t>
-      </w:r>
-      <w:proofErr w:type="spellEnd"/>
-      <w:r>
-        <w:rPr>
-          <w:b/>
-          <w:bCs/>
-        </w:rPr>
-        <w:t xml:space="preserve">). </w:t>
-      </w:r>
-      <w:r>
-        <w:t>API routes with their real database, components with their real dependencies. The largest layer per the Testing Trophy.</w:t>
-      </w:r>
-    </w:p>
-    <w:p>
-      <w:pPr>
-        <w:pStyle w:val="ListParagraph"/>
-        <w:numPr>
-          <w:ilvl w:val="0"/>
-          <w:numId w:val="2"/>
-        </w:numPr>
-        <w:spacing w:after="80" w:line="300" w:lineRule="auto"/>
-      </w:pPr>
-      <w:r>
-        <w:rPr>
-          <w:b/>
-          <w:bCs/>
-        </w:rPr>
-        <w:t xml:space="preserve">E2E tests (Playwright). </w:t>
-      </w:r>
-      <w:r>
-        <w:t>Critical user paths only — signup → onboarding → core feature flow.</w:t>
-      </w:r>
-    </w:p>
-    <w:p>
-      <w:pPr>
-        <w:spacing w:after="140" w:line="320" w:lineRule="auto"/>
-      </w:pPr>
-      <w:r>
         <w:lastRenderedPageBreak/>
-        <w:t>The value of keeping the source canonical in the feature spec is that the same scenario can be referenced from any of the three test files — and when the scenario changes, all three test layers know where to look.</w:t>
-      </w:r>
-    </w:p>
-    <w:p>
-      <w:pPr>
-        <w:pStyle w:val="Heading2"/>
-      </w:pPr>
-      <w:r>
-        <w:t>The Testing Trophy shape</w:t>
-      </w:r>
-    </w:p>
-    <w:p>
-      <w:pPr>
-        <w:spacing w:after="140" w:line="320" w:lineRule="auto"/>
-      </w:pPr>
-      <w:r>
         <w:t>Kent C. Dodds’s Testing Trophy replaces the classic testing pyramid. Static analysis is free and catches the largest class of bugs with zero test-writing effort. Integration tests are the largest layer — most of the testing time goes there. Database tests (</w:t>
       </w:r>
       <w:proofErr w:type="spellStart"/>
@@ -2806,15 +2804,15 @@
         <w:pStyle w:val="Heading2"/>
       </w:pPr>
       <w:r>
+        <w:t>Why this axis matters</w:t>
+      </w:r>
+    </w:p>
+    <w:p>
+      <w:pPr>
+        <w:spacing w:after="140" w:line="320" w:lineRule="auto"/>
+      </w:pPr>
+      <w:r>
         <w:lastRenderedPageBreak/>
-        <w:t>Why this axis matters</w:t>
-      </w:r>
-    </w:p>
-    <w:p>
-      <w:pPr>
-        <w:spacing w:after="140" w:line="320" w:lineRule="auto"/>
-      </w:pPr>
-      <w:r>
         <w:t>Chapters 1-4 describe what exists and how work moves through it. Chapter 5 describes how a new participant finds their place in it. It is the onboarding path.</w:t>
       </w:r>
     </w:p>
@@ -2982,12 +2980,6 @@
         <w:gridCol w:w="3120"/>
       </w:tblGrid>
       <w:tr>
-        <w:tblPrEx>
-          <w:tblCellMar>
-            <w:top w:w="0" w:type="dxa"/>
-            <w:bottom w:w="0" w:type="dxa"/>
-          </w:tblCellMar>
-        </w:tblPrEx>
         <w:trPr>
           <w:tblHeader/>
         </w:trPr>
@@ -3080,12 +3072,6 @@
         </w:tc>
       </w:tr>
       <w:tr>
-        <w:tblPrEx>
-          <w:tblCellMar>
-            <w:top w:w="0" w:type="dxa"/>
-            <w:bottom w:w="0" w:type="dxa"/>
-          </w:tblCellMar>
-        </w:tblPrEx>
         <w:tc>
           <w:tcPr>
             <w:tcW w:w="3120" w:type="dxa"/>
@@ -3176,12 +3162,6 @@
         </w:tc>
       </w:tr>
       <w:tr>
-        <w:tblPrEx>
-          <w:tblCellMar>
-            <w:top w:w="0" w:type="dxa"/>
-            <w:bottom w:w="0" w:type="dxa"/>
-          </w:tblCellMar>
-        </w:tblPrEx>
         <w:tc>
           <w:tcPr>
             <w:tcW w:w="3120" w:type="dxa"/>
@@ -3272,12 +3252,6 @@
         </w:tc>
       </w:tr>
       <w:tr>
-        <w:tblPrEx>
-          <w:tblCellMar>
-            <w:top w:w="0" w:type="dxa"/>
-            <w:bottom w:w="0" w:type="dxa"/>
-          </w:tblCellMar>
-        </w:tblPrEx>
         <w:tc>
           <w:tcPr>
             <w:tcW w:w="3120" w:type="dxa"/>
@@ -3368,12 +3342,6 @@
         </w:tc>
       </w:tr>
       <w:tr>
-        <w:tblPrEx>
-          <w:tblCellMar>
-            <w:top w:w="0" w:type="dxa"/>
-            <w:bottom w:w="0" w:type="dxa"/>
-          </w:tblCellMar>
-        </w:tblPrEx>
         <w:tc>
           <w:tcPr>
             <w:tcW w:w="3120" w:type="dxa"/>
@@ -3464,12 +3432,6 @@
         </w:tc>
       </w:tr>
       <w:tr>
-        <w:tblPrEx>
-          <w:tblCellMar>
-            <w:top w:w="0" w:type="dxa"/>
-            <w:bottom w:w="0" w:type="dxa"/>
-          </w:tblCellMar>
-        </w:tblPrEx>
         <w:tc>
           <w:tcPr>
             <w:tcW w:w="3120" w:type="dxa"/>
@@ -3560,12 +3522,6 @@
         </w:tc>
       </w:tr>
       <w:tr>
-        <w:tblPrEx>
-          <w:tblCellMar>
-            <w:top w:w="0" w:type="dxa"/>
-            <w:bottom w:w="0" w:type="dxa"/>
-          </w:tblCellMar>
-        </w:tblPrEx>
         <w:tc>
           <w:tcPr>
             <w:tcW w:w="3120" w:type="dxa"/>
@@ -3656,12 +3612,6 @@
         </w:tc>
       </w:tr>
       <w:tr>
-        <w:tblPrEx>
-          <w:tblCellMar>
-            <w:top w:w="0" w:type="dxa"/>
-            <w:bottom w:w="0" w:type="dxa"/>
-          </w:tblCellMar>
-        </w:tblPrEx>
         <w:tc>
           <w:tcPr>
             <w:tcW w:w="3120" w:type="dxa"/>
@@ -3761,12 +3711,6 @@
         </w:tc>
       </w:tr>
       <w:tr>
-        <w:tblPrEx>
-          <w:tblCellMar>
-            <w:top w:w="0" w:type="dxa"/>
-            <w:bottom w:w="0" w:type="dxa"/>
-          </w:tblCellMar>
-        </w:tblPrEx>
         <w:tc>
           <w:tcPr>
             <w:tcW w:w="3120" w:type="dxa"/>
@@ -3857,12 +3801,6 @@
         </w:tc>
       </w:tr>
       <w:tr>
-        <w:tblPrEx>
-          <w:tblCellMar>
-            <w:top w:w="0" w:type="dxa"/>
-            <w:bottom w:w="0" w:type="dxa"/>
-          </w:tblCellMar>
-        </w:tblPrEx>
         <w:tc>
           <w:tcPr>
             <w:tcW w:w="3120" w:type="dxa"/>
@@ -3953,12 +3891,6 @@
         </w:tc>
       </w:tr>
       <w:tr>
-        <w:tblPrEx>
-          <w:tblCellMar>
-            <w:top w:w="0" w:type="dxa"/>
-            <w:bottom w:w="0" w:type="dxa"/>
-          </w:tblCellMar>
-        </w:tblPrEx>
         <w:tc>
           <w:tcPr>
             <w:tcW w:w="3120" w:type="dxa"/>
@@ -4049,12 +3981,6 @@
         </w:tc>
       </w:tr>
       <w:tr>
-        <w:tblPrEx>
-          <w:tblCellMar>
-            <w:top w:w="0" w:type="dxa"/>
-            <w:bottom w:w="0" w:type="dxa"/>
-          </w:tblCellMar>
-        </w:tblPrEx>
         <w:tc>
           <w:tcPr>
             <w:tcW w:w="3120" w:type="dxa"/>
@@ -4145,12 +4071,6 @@
         </w:tc>
       </w:tr>
       <w:tr>
-        <w:tblPrEx>
-          <w:tblCellMar>
-            <w:top w:w="0" w:type="dxa"/>
-            <w:bottom w:w="0" w:type="dxa"/>
-          </w:tblCellMar>
-        </w:tblPrEx>
         <w:tc>
           <w:tcPr>
             <w:tcW w:w="3120" w:type="dxa"/>
@@ -4241,12 +4161,6 @@
         </w:tc>
       </w:tr>
       <w:tr>
-        <w:tblPrEx>
-          <w:tblCellMar>
-            <w:top w:w="0" w:type="dxa"/>
-            <w:bottom w:w="0" w:type="dxa"/>
-          </w:tblCellMar>
-        </w:tblPrEx>
         <w:tc>
           <w:tcPr>
             <w:tcW w:w="3120" w:type="dxa"/>
@@ -4337,12 +4251,6 @@
         </w:tc>
       </w:tr>
       <w:tr>
-        <w:tblPrEx>
-          <w:tblCellMar>
-            <w:top w:w="0" w:type="dxa"/>
-            <w:bottom w:w="0" w:type="dxa"/>
-          </w:tblCellMar>
-        </w:tblPrEx>
         <w:tc>
           <w:tcPr>
             <w:tcW w:w="3120" w:type="dxa"/>
@@ -4433,12 +4341,6 @@
         </w:tc>
       </w:tr>
       <w:tr>
-        <w:tblPrEx>
-          <w:tblCellMar>
-            <w:top w:w="0" w:type="dxa"/>
-            <w:bottom w:w="0" w:type="dxa"/>
-          </w:tblCellMar>
-        </w:tblPrEx>
         <w:tc>
           <w:tcPr>
             <w:tcW w:w="3120" w:type="dxa"/>
@@ -4529,12 +4431,6 @@
         </w:tc>
       </w:tr>
       <w:tr>
-        <w:tblPrEx>
-          <w:tblCellMar>
-            <w:top w:w="0" w:type="dxa"/>
-            <w:bottom w:w="0" w:type="dxa"/>
-          </w:tblCellMar>
-        </w:tblPrEx>
         <w:tc>
           <w:tcPr>
             <w:tcW w:w="3120" w:type="dxa"/>
@@ -4625,12 +4521,6 @@
         </w:tc>
       </w:tr>
       <w:tr>
-        <w:tblPrEx>
-          <w:tblCellMar>
-            <w:top w:w="0" w:type="dxa"/>
-            <w:bottom w:w="0" w:type="dxa"/>
-          </w:tblCellMar>
-        </w:tblPrEx>
         <w:tc>
           <w:tcPr>
             <w:tcW w:w="3120" w:type="dxa"/>
@@ -4721,12 +4611,6 @@
         </w:tc>
       </w:tr>
       <w:tr>
-        <w:tblPrEx>
-          <w:tblCellMar>
-            <w:top w:w="0" w:type="dxa"/>
-            <w:bottom w:w="0" w:type="dxa"/>
-          </w:tblCellMar>
-        </w:tblPrEx>
         <w:tc>
           <w:tcPr>
             <w:tcW w:w="3120" w:type="dxa"/>
@@ -4827,8 +4711,76 @@
         <w:pStyle w:val="Heading2"/>
       </w:pPr>
       <w:r>
+        <w:t>Priority summary</w:t>
+      </w:r>
+    </w:p>
+    <w:p>
+      <w:pPr>
+        <w:pStyle w:val="Heading3"/>
+      </w:pPr>
+      <w:r>
         <w:lastRenderedPageBreak/>
-        <w:t>Priority summary</w:t>
+        <w:t>High priority</w:t>
+      </w:r>
+    </w:p>
+    <w:p>
+      <w:pPr>
+        <w:pStyle w:val="ListParagraph"/>
+        <w:numPr>
+          <w:ilvl w:val="0"/>
+          <w:numId w:val="2"/>
+        </w:numPr>
+        <w:spacing w:after="80" w:line="300" w:lineRule="auto"/>
+      </w:pPr>
+      <w:r>
+        <w:t>G-03 Vertical specs are scaffolds</w:t>
+      </w:r>
+    </w:p>
+    <w:p>
+      <w:pPr>
+        <w:pStyle w:val="ListParagraph"/>
+        <w:numPr>
+          <w:ilvl w:val="0"/>
+          <w:numId w:val="2"/>
+        </w:numPr>
+        <w:spacing w:after="80" w:line="300" w:lineRule="auto"/>
+      </w:pPr>
+      <w:r>
+        <w:t>G-05 Review queue not operationalized</w:t>
+      </w:r>
+    </w:p>
+    <w:p>
+      <w:pPr>
+        <w:pStyle w:val="ListParagraph"/>
+        <w:numPr>
+          <w:ilvl w:val="0"/>
+          <w:numId w:val="2"/>
+        </w:numPr>
+        <w:spacing w:after="80" w:line="300" w:lineRule="auto"/>
+      </w:pPr>
+      <w:r>
+        <w:t xml:space="preserve">G-06 </w:t>
+      </w:r>
+      <w:proofErr w:type="gramStart"/>
+      <w:r>
+        <w:t>Multi-agent</w:t>
+      </w:r>
+      <w:proofErr w:type="gramEnd"/>
+      <w:r>
+        <w:t xml:space="preserve"> task locking</w:t>
+      </w:r>
+    </w:p>
+    <w:p>
+      <w:pPr>
+        <w:pStyle w:val="ListParagraph"/>
+        <w:numPr>
+          <w:ilvl w:val="0"/>
+          <w:numId w:val="2"/>
+        </w:numPr>
+        <w:spacing w:after="80" w:line="300" w:lineRule="auto"/>
+      </w:pPr>
+      <w:r>
+        <w:t>G-12 Given/When/Then to test translation</w:t>
       </w:r>
     </w:p>
     <w:p>
@@ -4836,67 +4788,158 @@
         <w:pStyle w:val="Heading3"/>
       </w:pPr>
       <w:r>
-        <w:t>High priority</w:t>
-      </w:r>
-    </w:p>
-    <w:p>
-      <w:pPr>
-        <w:pStyle w:val="ListParagraph"/>
-        <w:numPr>
-          <w:ilvl w:val="0"/>
-          <w:numId w:val="2"/>
-        </w:numPr>
-        <w:spacing w:after="80" w:line="300" w:lineRule="auto"/>
-      </w:pPr>
-      <w:r>
-        <w:t>G-03 Vertical specs are scaffolds</w:t>
-      </w:r>
-    </w:p>
-    <w:p>
-      <w:pPr>
-        <w:pStyle w:val="ListParagraph"/>
-        <w:numPr>
-          <w:ilvl w:val="0"/>
-          <w:numId w:val="2"/>
-        </w:numPr>
-        <w:spacing w:after="80" w:line="300" w:lineRule="auto"/>
-      </w:pPr>
-      <w:r>
-        <w:t>G-05 Review queue not operationalized</w:t>
-      </w:r>
-    </w:p>
-    <w:p>
-      <w:pPr>
-        <w:pStyle w:val="ListParagraph"/>
-        <w:numPr>
-          <w:ilvl w:val="0"/>
-          <w:numId w:val="2"/>
-        </w:numPr>
-        <w:spacing w:after="80" w:line="300" w:lineRule="auto"/>
-      </w:pPr>
-      <w:r>
-        <w:t xml:space="preserve">G-06 </w:t>
-      </w:r>
-      <w:proofErr w:type="gramStart"/>
-      <w:r>
-        <w:t>Multi-agent</w:t>
-      </w:r>
-      <w:proofErr w:type="gramEnd"/>
-      <w:r>
-        <w:t xml:space="preserve"> task locking</w:t>
-      </w:r>
-    </w:p>
-    <w:p>
-      <w:pPr>
-        <w:pStyle w:val="ListParagraph"/>
-        <w:numPr>
-          <w:ilvl w:val="0"/>
-          <w:numId w:val="2"/>
-        </w:numPr>
-        <w:spacing w:after="80" w:line="300" w:lineRule="auto"/>
-      </w:pPr>
-      <w:r>
-        <w:t>G-12 Given/When/Then to test translation</w:t>
+        <w:t>Medium priority</w:t>
+      </w:r>
+    </w:p>
+    <w:p>
+      <w:pPr>
+        <w:pStyle w:val="ListParagraph"/>
+        <w:numPr>
+          <w:ilvl w:val="0"/>
+          <w:numId w:val="2"/>
+        </w:numPr>
+        <w:spacing w:after="80" w:line="300" w:lineRule="auto"/>
+      </w:pPr>
+      <w:r>
+        <w:t>G-01 Whisp architectural placement</w:t>
+      </w:r>
+    </w:p>
+    <w:p>
+      <w:pPr>
+        <w:pStyle w:val="ListParagraph"/>
+        <w:numPr>
+          <w:ilvl w:val="0"/>
+          <w:numId w:val="2"/>
+        </w:numPr>
+        <w:spacing w:after="80" w:line="300" w:lineRule="auto"/>
+      </w:pPr>
+      <w:r>
+        <w:t>G-02 Cross-product feature sync</w:t>
+      </w:r>
+    </w:p>
+    <w:p>
+      <w:pPr>
+        <w:pStyle w:val="ListParagraph"/>
+        <w:numPr>
+          <w:ilvl w:val="0"/>
+          <w:numId w:val="2"/>
+        </w:numPr>
+        <w:spacing w:after="80" w:line="300" w:lineRule="auto"/>
+      </w:pPr>
+      <w:r>
+        <w:t>G-04 Wave ↔ roadmap relationship</w:t>
+      </w:r>
+    </w:p>
+    <w:p>
+      <w:pPr>
+        <w:pStyle w:val="ListParagraph"/>
+        <w:numPr>
+          <w:ilvl w:val="0"/>
+          <w:numId w:val="2"/>
+        </w:numPr>
+        <w:spacing w:after="80" w:line="300" w:lineRule="auto"/>
+      </w:pPr>
+      <w:r>
+        <w:t xml:space="preserve">G-07 </w:t>
+      </w:r>
+      <w:proofErr w:type="spellStart"/>
+      <w:r>
+        <w:t>Ferd</w:t>
+      </w:r>
+      <w:proofErr w:type="spellEnd"/>
+      <w:r>
+        <w:t xml:space="preserve"> DoD empty</w:t>
+      </w:r>
+    </w:p>
+    <w:p>
+      <w:pPr>
+        <w:pStyle w:val="ListParagraph"/>
+        <w:numPr>
+          <w:ilvl w:val="0"/>
+          <w:numId w:val="2"/>
+        </w:numPr>
+        <w:spacing w:after="80" w:line="300" w:lineRule="auto"/>
+      </w:pPr>
+      <w:r>
+        <w:t>G-09 Refinement ritual undocumented</w:t>
+      </w:r>
+    </w:p>
+    <w:p>
+      <w:pPr>
+        <w:pStyle w:val="ListParagraph"/>
+        <w:numPr>
+          <w:ilvl w:val="0"/>
+          <w:numId w:val="2"/>
+        </w:numPr>
+        <w:spacing w:after="80" w:line="300" w:lineRule="auto"/>
+      </w:pPr>
+      <w:r>
+        <w:t>G-10 Board mechanic unchosen</w:t>
+      </w:r>
+    </w:p>
+    <w:p>
+      <w:pPr>
+        <w:pStyle w:val="ListParagraph"/>
+        <w:numPr>
+          <w:ilvl w:val="0"/>
+          <w:numId w:val="2"/>
+        </w:numPr>
+        <w:spacing w:after="80" w:line="300" w:lineRule="auto"/>
+      </w:pPr>
+      <w:r>
+        <w:t>G-13 Build hygiene unspecified</w:t>
+      </w:r>
+    </w:p>
+    <w:p>
+      <w:pPr>
+        <w:pStyle w:val="ListParagraph"/>
+        <w:numPr>
+          <w:ilvl w:val="0"/>
+          <w:numId w:val="2"/>
+        </w:numPr>
+        <w:spacing w:after="80" w:line="300" w:lineRule="auto"/>
+      </w:pPr>
+      <w:r>
+        <w:t>G-14 Discovery 0→2 flow orphaned</w:t>
+      </w:r>
+    </w:p>
+    <w:p>
+      <w:pPr>
+        <w:pStyle w:val="ListParagraph"/>
+        <w:numPr>
+          <w:ilvl w:val="0"/>
+          <w:numId w:val="2"/>
+        </w:numPr>
+        <w:spacing w:after="80" w:line="300" w:lineRule="auto"/>
+      </w:pPr>
+      <w:r>
+        <w:t>G-15 Cross-tier entry order</w:t>
+      </w:r>
+    </w:p>
+    <w:p>
+      <w:pPr>
+        <w:pStyle w:val="ListParagraph"/>
+        <w:numPr>
+          <w:ilvl w:val="0"/>
+          <w:numId w:val="2"/>
+        </w:numPr>
+        <w:spacing w:after="80" w:line="300" w:lineRule="auto"/>
+      </w:pPr>
+      <w:r>
+        <w:t>G-16 Skill chaining undocumented</w:t>
+      </w:r>
+    </w:p>
+    <w:p>
+      <w:pPr>
+        <w:pStyle w:val="ListParagraph"/>
+        <w:numPr>
+          <w:ilvl w:val="0"/>
+          <w:numId w:val="2"/>
+        </w:numPr>
+        <w:spacing w:after="80" w:line="300" w:lineRule="auto"/>
+      </w:pPr>
+      <w:r>
+        <w:t>G-18 Research pathway under-specified</w:t>
       </w:r>
     </w:p>
     <w:p>
@@ -4904,165 +4947,6 @@
         <w:pStyle w:val="Heading3"/>
       </w:pPr>
       <w:r>
-        <w:t>Medium priority</w:t>
-      </w:r>
-    </w:p>
-    <w:p>
-      <w:pPr>
-        <w:pStyle w:val="ListParagraph"/>
-        <w:numPr>
-          <w:ilvl w:val="0"/>
-          <w:numId w:val="2"/>
-        </w:numPr>
-        <w:spacing w:after="80" w:line="300" w:lineRule="auto"/>
-      </w:pPr>
-      <w:r>
-        <w:t>G-01 Whisp architectural placement</w:t>
-      </w:r>
-    </w:p>
-    <w:p>
-      <w:pPr>
-        <w:pStyle w:val="ListParagraph"/>
-        <w:numPr>
-          <w:ilvl w:val="0"/>
-          <w:numId w:val="2"/>
-        </w:numPr>
-        <w:spacing w:after="80" w:line="300" w:lineRule="auto"/>
-      </w:pPr>
-      <w:r>
-        <w:t>G-02 Cross-product feature sync</w:t>
-      </w:r>
-    </w:p>
-    <w:p>
-      <w:pPr>
-        <w:pStyle w:val="ListParagraph"/>
-        <w:numPr>
-          <w:ilvl w:val="0"/>
-          <w:numId w:val="2"/>
-        </w:numPr>
-        <w:spacing w:after="80" w:line="300" w:lineRule="auto"/>
-      </w:pPr>
-      <w:r>
-        <w:t>G-04 Wave ↔ roadmap relationship</w:t>
-      </w:r>
-    </w:p>
-    <w:p>
-      <w:pPr>
-        <w:pStyle w:val="ListParagraph"/>
-        <w:numPr>
-          <w:ilvl w:val="0"/>
-          <w:numId w:val="2"/>
-        </w:numPr>
-        <w:spacing w:after="80" w:line="300" w:lineRule="auto"/>
-      </w:pPr>
-      <w:r>
-        <w:t xml:space="preserve">G-07 </w:t>
-      </w:r>
-      <w:proofErr w:type="spellStart"/>
-      <w:r>
-        <w:t>Ferd</w:t>
-      </w:r>
-      <w:proofErr w:type="spellEnd"/>
-      <w:r>
-        <w:t xml:space="preserve"> DoD empty</w:t>
-      </w:r>
-    </w:p>
-    <w:p>
-      <w:pPr>
-        <w:pStyle w:val="ListParagraph"/>
-        <w:numPr>
-          <w:ilvl w:val="0"/>
-          <w:numId w:val="2"/>
-        </w:numPr>
-        <w:spacing w:after="80" w:line="300" w:lineRule="auto"/>
-      </w:pPr>
-      <w:r>
-        <w:t>G-09 Refinement ritual undocumented</w:t>
-      </w:r>
-    </w:p>
-    <w:p>
-      <w:pPr>
-        <w:pStyle w:val="ListParagraph"/>
-        <w:numPr>
-          <w:ilvl w:val="0"/>
-          <w:numId w:val="2"/>
-        </w:numPr>
-        <w:spacing w:after="80" w:line="300" w:lineRule="auto"/>
-      </w:pPr>
-      <w:r>
-        <w:t>G-10 Board mechanic unchosen</w:t>
-      </w:r>
-    </w:p>
-    <w:p>
-      <w:pPr>
-        <w:pStyle w:val="ListParagraph"/>
-        <w:numPr>
-          <w:ilvl w:val="0"/>
-          <w:numId w:val="2"/>
-        </w:numPr>
-        <w:spacing w:after="80" w:line="300" w:lineRule="auto"/>
-      </w:pPr>
-      <w:r>
-        <w:t>G-13 Build hygiene unspecified</w:t>
-      </w:r>
-    </w:p>
-    <w:p>
-      <w:pPr>
-        <w:pStyle w:val="ListParagraph"/>
-        <w:numPr>
-          <w:ilvl w:val="0"/>
-          <w:numId w:val="2"/>
-        </w:numPr>
-        <w:spacing w:after="80" w:line="300" w:lineRule="auto"/>
-      </w:pPr>
-      <w:r>
-        <w:t>G-14 Discovery 0→2 flow orphaned</w:t>
-      </w:r>
-    </w:p>
-    <w:p>
-      <w:pPr>
-        <w:pStyle w:val="ListParagraph"/>
-        <w:numPr>
-          <w:ilvl w:val="0"/>
-          <w:numId w:val="2"/>
-        </w:numPr>
-        <w:spacing w:after="80" w:line="300" w:lineRule="auto"/>
-      </w:pPr>
-      <w:r>
-        <w:t>G-15 Cross-tier entry order</w:t>
-      </w:r>
-    </w:p>
-    <w:p>
-      <w:pPr>
-        <w:pStyle w:val="ListParagraph"/>
-        <w:numPr>
-          <w:ilvl w:val="0"/>
-          <w:numId w:val="2"/>
-        </w:numPr>
-        <w:spacing w:after="80" w:line="300" w:lineRule="auto"/>
-      </w:pPr>
-      <w:r>
-        <w:t>G-16 Skill chaining undocumented</w:t>
-      </w:r>
-    </w:p>
-    <w:p>
-      <w:pPr>
-        <w:pStyle w:val="ListParagraph"/>
-        <w:numPr>
-          <w:ilvl w:val="0"/>
-          <w:numId w:val="2"/>
-        </w:numPr>
-        <w:spacing w:after="80" w:line="300" w:lineRule="auto"/>
-      </w:pPr>
-      <w:r>
-        <w:t>G-18 Research pathway under-specified</w:t>
-      </w:r>
-    </w:p>
-    <w:p>
-      <w:pPr>
-        <w:pStyle w:val="Heading3"/>
-      </w:pPr>
-      <w:r>
         <w:t>Low priority</w:t>
       </w:r>
     </w:p>
@@ -5134,28 +5018,28 @@
         <w:pStyle w:val="Heading2"/>
       </w:pPr>
       <w:r>
+        <w:t>Canonical sources this document is built on</w:t>
+      </w:r>
+    </w:p>
+    <w:p>
+      <w:pPr>
+        <w:spacing w:after="140" w:line="320" w:lineRule="auto"/>
+      </w:pPr>
+      <w:r>
+        <w:t>This document is a view onto the canonical sources. When they change, this document must be updated to match. When it disagrees with a canonical source, the canonical source wins.</w:t>
+      </w:r>
+    </w:p>
+    <w:p>
+      <w:pPr>
+        <w:pStyle w:val="ListParagraph"/>
+        <w:numPr>
+          <w:ilvl w:val="0"/>
+          <w:numId w:val="2"/>
+        </w:numPr>
+        <w:spacing w:after="80" w:line="300" w:lineRule="auto"/>
+      </w:pPr>
+      <w:r>
         <w:lastRenderedPageBreak/>
-        <w:t>Canonical sources this document is built on</w:t>
-      </w:r>
-    </w:p>
-    <w:p>
-      <w:pPr>
-        <w:spacing w:after="140" w:line="320" w:lineRule="auto"/>
-      </w:pPr>
-      <w:r>
-        <w:t>This document is a view onto the canonical sources. When they change, this document must be updated to match. When it disagrees with a canonical source, the canonical source wins.</w:t>
-      </w:r>
-    </w:p>
-    <w:p>
-      <w:pPr>
-        <w:pStyle w:val="ListParagraph"/>
-        <w:numPr>
-          <w:ilvl w:val="0"/>
-          <w:numId w:val="2"/>
-        </w:numPr>
-        <w:spacing w:after="80" w:line="300" w:lineRule="auto"/>
-      </w:pPr>
-      <w:r>
         <w:t>docs/ecosystem/VISION.md — the constitutional document</w:t>
       </w:r>
     </w:p>
@@ -5254,7 +5138,7 @@
       <w:headerReference w:type="default" r:id="rId12"/>
       <w:footerReference w:type="default" r:id="rId13"/>
       <w:pgSz w:w="12240" w:h="15840"/>
-      <w:pgMar w:top="1440" w:right="1440" w:bottom="1440" w:left="1440" w:header="708" w:footer="708" w:gutter="0"/>
+      <w:pgMar w:top="851" w:right="1440" w:bottom="1135" w:left="1440" w:header="708" w:footer="170" w:gutter="0"/>
       <w:cols w:space="720"/>
       <w:docGrid w:linePitch="360"/>
     </w:sectPr>

</xml_diff>